<commit_message>
docs: update README and docs
</commit_message>
<xml_diff>
--- a/docs/Bai-test-Backend-AI.docx
+++ b/docs/Bai-test-Backend-AI.docx
@@ -2,29 +2,6 @@
 <file path=word/document.xml><?xml version="1.0" encoding="utf-8"?>
 <w:document xmlns:wpc="http://schemas.microsoft.com/office/word/2010/wordprocessingCanvas" xmlns:cx="http://schemas.microsoft.com/office/drawing/2014/chartex" xmlns:cx1="http://schemas.microsoft.com/office/drawing/2015/9/8/chartex" xmlns:cx2="http://schemas.microsoft.com/office/drawing/2015/10/21/chartex" xmlns:cx3="http://schemas.microsoft.com/office/drawing/2016/5/9/chartex" xmlns:cx4="http://schemas.microsoft.com/office/drawing/2016/5/10/chartex" xmlns:cx5="http://schemas.microsoft.com/office/drawing/2016/5/11/chartex" xmlns:cx6="http://schemas.microsoft.com/office/drawing/2016/5/12/chartex" xmlns:cx7="http://schemas.microsoft.com/office/drawing/2016/5/13/chartex" xmlns:cx8="http://schemas.microsoft.com/office/drawing/2016/5/14/chartex" xmlns:mc="http://schemas.openxmlformats.org/markup-compatibility/2006" xmlns:aink="http://schemas.microsoft.com/office/drawing/2016/ink" xmlns:am3d="http://schemas.microsoft.com/office/drawing/2017/model3d" xmlns:o="urn:schemas-microsoft-com:office:office" xmlns:oel="http://schemas.microsoft.com/office/2019/extlst" xmlns:r="http://schemas.openxmlformats.org/officeDocument/2006/relationships" xmlns:m="http://schemas.openxmlformats.org/officeDocument/2006/math" xmlns:v="urn:schemas-microsoft-com:vml" xmlns:wp14="http://schemas.microsoft.com/office/word/2010/wordprocessingDrawing" xmlns:wp="http://schemas.openxmlformats.org/drawingml/2006/wordprocessingDrawing" xmlns:w10="urn:schemas-microsoft-com:office:word" xmlns:w="http://schemas.openxmlformats.org/wordprocessingml/2006/main" xmlns:w14="http://schemas.microsoft.com/office/word/2010/wordml" xmlns:w15="http://schemas.microsoft.com/office/word/2012/wordml" xmlns:w16cex="http://schemas.microsoft.com/office/word/2018/wordml/cex" xmlns:w16cid="http://schemas.microsoft.com/office/word/2016/wordml/cid" xmlns:w16="http://schemas.microsoft.com/office/word/2018/wordml" xmlns:w16du="http://schemas.microsoft.com/office/word/2023/wordml/word16du" xmlns:w16sdtdh="http://schemas.microsoft.com/office/word/2020/wordml/sdtdatahash" xmlns:w16sdtfl="http://schemas.microsoft.com/office/word/2024/wordml/sdtformatlock" xmlns:w16se="http://schemas.microsoft.com/office/word/2015/wordml/symex" xmlns:wpg="http://schemas.microsoft.com/office/word/2010/wordprocessingGroup" xmlns:wpi="http://schemas.microsoft.com/office/word/2010/wordprocessingInk" xmlns:wne="http://schemas.microsoft.com/office/word/2006/wordml" xmlns:wps="http://schemas.microsoft.com/office/word/2010/wordprocessingShape" mc:Ignorable="w14 w15 w16se w16cid w16 w16cex w16sdtdh w16sdtfl w16du wp14">
   <w:body>
-    <w:p>
-      <w:pPr>
-        <w:rPr>
-          <w:rFonts w:ascii="Arial" w:eastAsia="Times New Roman" w:hAnsi="Arial" w:cs="Arial"/>
-          <w:b/>
-          <w:bCs/>
-          <w:color w:val="000000"/>
-          <w:sz w:val="28"/>
-          <w:szCs w:val="28"/>
-        </w:rPr>
-      </w:pPr>
-      <w:r>
-        <w:rPr>
-          <w:rFonts w:ascii="Arial" w:eastAsia="Times New Roman" w:hAnsi="Arial" w:cs="Arial"/>
-          <w:b/>
-          <w:bCs/>
-          <w:color w:val="000000"/>
-          <w:sz w:val="28"/>
-          <w:szCs w:val="28"/>
-        </w:rPr>
-        <w:t>Công ty TNM GROUP</w:t>
-      </w:r>
-    </w:p>
     <w:p>
       <w:pPr>
         <w:pStyle w:val="Title"/>
@@ -269,63 +246,6 @@
     </w:p>
     <w:p>
       <w:pPr>
-        <w:pBdr>
-          <w:left w:val="single" w:sz="20" w:space="8" w:color="0D7F8E"/>
-        </w:pBdr>
-        <w:shd w:val="clear" w:color="auto" w:fill="E9F4F5"/>
-        <w:spacing w:after="200"/>
-        <w:ind w:left="215"/>
-      </w:pPr>
-      <w:r>
-        <w:rPr>
-          <w:b/>
-          <w:bCs/>
-          <w:color w:val="0D7F8E"/>
-          <w:sz w:val="23"/>
-          <w:szCs w:val="23"/>
-        </w:rPr>
-        <w:t>Về việc dùng AI khi làm bài</w:t>
-      </w:r>
-    </w:p>
-    <w:p>
-      <w:pPr>
-        <w:shd w:val="clear" w:color="auto" w:fill="E9F4F5"/>
-        <w:spacing w:after="90" w:line="290" w:lineRule="auto"/>
-        <w:ind w:left="215"/>
-      </w:pPr>
-      <w:r>
-        <w:t>Được phép dùng AI (Copilot, ChatGPT, Claude...) trong toàn bộ quá trình làm bài — không bị trừ điểm vì dùng AI. Ngôn ngữ và framework cũng hoàn toàn tự chọn.</w:t>
-      </w:r>
-    </w:p>
-    <w:p>
-      <w:pPr>
-        <w:shd w:val="clear" w:color="auto" w:fill="E9F4F5"/>
-        <w:spacing w:after="90" w:line="290" w:lineRule="auto"/>
-        <w:ind w:left="215"/>
-      </w:pPr>
-      <w:r>
-        <w:rPr>
-          <w:b/>
-          <w:bCs/>
-        </w:rPr>
-        <w:t xml:space="preserve">Bắt buộc: </w:t>
-      </w:r>
-      <w:r>
-        <w:t>nộp kèm đoạn hội thoại AI đã dùng (copy lại prompt và câu trả lời), nếu có sử dụng.</w:t>
-      </w:r>
-    </w:p>
-    <w:p>
-      <w:pPr>
-        <w:shd w:val="clear" w:color="auto" w:fill="E9F4F5"/>
-        <w:spacing w:after="130" w:line="290" w:lineRule="auto"/>
-        <w:ind w:left="215"/>
-      </w:pPr>
-      <w:r>
-        <w:t>Không đánh giá theo ngôn ngữ hay việc có dùng AI hay không. Đánh giá theo: cách bạn giải quyết bài toán, code có thực sự chạy đúng và có được kiểm tra kỹ hay không, và khi phỏng vấn bạn có giải thích được từng dòng mình nộp không — kể cả những dòng do AI viết.</w:t>
-      </w:r>
-    </w:p>
-    <w:p>
-      <w:pPr>
         <w:pStyle w:val="Heading1"/>
         <w:pBdr>
           <w:bottom w:val="single" w:sz="8" w:space="4" w:color="334A6E"/>
@@ -434,7 +354,6 @@
         <w:spacing w:after="90" w:line="290" w:lineRule="auto"/>
       </w:pPr>
       <w:r>
-        <w:lastRenderedPageBreak/>
         <w:t>Mật khẩu không được lưu ở dạng đọc ngược lại được — không lưu plain text.</w:t>
       </w:r>
     </w:p>
@@ -589,6 +508,7 @@
                 <w:sz w:val="20"/>
                 <w:szCs w:val="20"/>
               </w:rPr>
+              <w:lastRenderedPageBreak/>
               <w:t>Đăng ký lại với email đã tồn tại — kể cả khi 2 request gửi gần như đồng thời</w:t>
             </w:r>
           </w:p>

</xml_diff>